<commit_message>
Define companion reproducibility repository
</commit_message>
<xml_diff>
--- a/supplementary/ReID_Review_Supplementary_Appendices_A-E.docx
+++ b/supplementary/ReID_Review_Supplementary_Appendices_A-E.docx
@@ -12,26 +12,270 @@
       </w:r>
     </w:p>
     <w:p>
+      <w:pPr/>
       <w:r>
-        <w:t>This supplementary material contains the detailed appendices referenced by the main manuscript. Citation numbers correspond to the reference list in the main manuscript. The repository contains metadata, evidence links, and protocol descriptions only; it does not redistribute restricted dataset files.</w:t>
+        <w:t>Companion repository:</w:t>
       </w:r>
     </w:p>
+    <w:p>
+      <w:pPr/>
+      <w:r>
+        <w:t>https://github.com/Trans1010/person-reid-datasets-methods-protocols</w:t>
+      </w:r>
+    </w:p>
+    <w:p>
+      <w:r>
+        <w:t>This supplementary material contains the detailed appendices referenced by the main manuscript. Citation numbers correspond to the reference list in the main manuscript. The companion repository provides machine-readable registry files, evidence links, and protocol descriptions associated with this review. Restricted dataset files are not redistributed. Registry entries were last verified on 4 September 2026. The literature search in Table S1 was last updated on 4 August 2026.</w:t>
+      </w:r>
+    </w:p>
+    <w:p>
+      <w:pPr>
+        <w:pStyle w:val="Caption"/>
+      </w:pPr>
+      <w:r>
+        <w:t>Table S1. Representative search strategies.</w:t>
+      </w:r>
+    </w:p>
+    <w:tbl>
+      <w:tblPr>
+        <w:tblStyle w:val="TableGrid"/>
+        <w:tblW w:type="auto" w:w="0"/>
+        <w:tblLook w:firstColumn="1" w:firstRow="1" w:lastColumn="0" w:lastRow="0" w:noHBand="0" w:noVBand="1" w:val="04A0"/>
+      </w:tblPr>
+      <w:tblGrid>
+        <w:gridCol w:w="2592"/>
+        <w:gridCol w:w="2592"/>
+        <w:gridCol w:w="2592"/>
+        <w:gridCol w:w="2592"/>
+      </w:tblGrid>
+      <w:tr>
+        <w:tc>
+          <w:tcPr>
+            <w:tcW w:type="dxa" w:w="1944"/>
+          </w:tcPr>
+          <w:p>
+            <w:r>
+              <w:rPr>
+                <w:b/>
+                <w:sz w:val="17"/>
+              </w:rPr>
+              <w:t>Database</w:t>
+            </w:r>
+          </w:p>
+        </w:tc>
+        <w:tc>
+          <w:tcPr>
+            <w:tcW w:type="dxa" w:w="7560"/>
+          </w:tcPr>
+          <w:p>
+            <w:r>
+              <w:rPr>
+                <w:b/>
+                <w:sz w:val="17"/>
+              </w:rPr>
+              <w:t>Representative search strategy</w:t>
+            </w:r>
+          </w:p>
+        </w:tc>
+        <w:tc>
+          <w:tcPr>
+            <w:tcW w:type="dxa" w:w="1944"/>
+          </w:tcPr>
+          <w:p>
+            <w:r>
+              <w:rPr>
+                <w:b/>
+                <w:sz w:val="17"/>
+              </w:rPr>
+              <w:t>Time range</w:t>
+            </w:r>
+          </w:p>
+        </w:tc>
+        <w:tc>
+          <w:tcPr>
+            <w:tcW w:type="dxa" w:w="1728"/>
+          </w:tcPr>
+          <w:p>
+            <w:r>
+              <w:rPr>
+                <w:b/>
+                <w:sz w:val="17"/>
+              </w:rPr>
+              <w:t>Last search date</w:t>
+            </w:r>
+          </w:p>
+        </w:tc>
+      </w:tr>
+      <w:tr>
+        <w:tc>
+          <w:tcPr>
+            <w:tcW w:type="dxa" w:w="1944"/>
+          </w:tcPr>
+          <w:p>
+            <w:r>
+              <w:rPr>
+                <w:sz w:val="17"/>
+              </w:rPr>
+              <w:t>Web of Science Core Collection</w:t>
+            </w:r>
+          </w:p>
+        </w:tc>
+        <w:tc>
+          <w:tcPr>
+            <w:tcW w:type="dxa" w:w="7560"/>
+          </w:tcPr>
+          <w:p>
+            <w:r>
+              <w:rPr>
+                <w:sz w:val="17"/>
+              </w:rPr>
+              <w:t>TS=("person re-identification" OR "person re-ID") AND TS=(dataset* OR benchmark* OR "evaluation protocol") AND TS=(infrared OR multispectral OR multimodal OR "cross-modal" OR UAV OR drone OR aerial OR "mixed gallery" OR "mixed-source" OR "unified retrieval" OR "any-scenario")</w:t>
+            </w:r>
+          </w:p>
+        </w:tc>
+        <w:tc>
+          <w:tcPr>
+            <w:tcW w:type="dxa" w:w="1944"/>
+          </w:tcPr>
+          <w:p>
+            <w:r>
+              <w:t>1 January 2007?4 August 2026</w:t>
+            </w:r>
+          </w:p>
+        </w:tc>
+        <w:tc>
+          <w:tcPr>
+            <w:tcW w:type="dxa" w:w="1728"/>
+          </w:tcPr>
+          <w:p>
+            <w:r>
+              <w:rPr>
+                <w:sz w:val="17"/>
+              </w:rPr>
+              <w:t>4 August 2026</w:t>
+            </w:r>
+          </w:p>
+        </w:tc>
+      </w:tr>
+      <w:tr>
+        <w:tc>
+          <w:tcPr>
+            <w:tcW w:type="dxa" w:w="1944"/>
+          </w:tcPr>
+          <w:p>
+            <w:r>
+              <w:rPr>
+                <w:sz w:val="17"/>
+              </w:rPr>
+              <w:t>IEEE Xplore</w:t>
+            </w:r>
+          </w:p>
+        </w:tc>
+        <w:tc>
+          <w:tcPr>
+            <w:tcW w:type="dxa" w:w="7560"/>
+          </w:tcPr>
+          <w:p>
+            <w:r>
+              <w:rPr>
+                <w:sz w:val="17"/>
+              </w:rPr>
+              <w:t>("person re-identification" OR "person re-ID") AND (dataset OR benchmark OR "evaluation protocol") AND (infrared OR multispectral OR multimodal OR "cross-modal" OR UAV OR aerial OR "mixed gallery" OR "mixed-source" OR "unified retrieval" OR "any-scenario")</w:t>
+            </w:r>
+          </w:p>
+        </w:tc>
+        <w:tc>
+          <w:tcPr>
+            <w:tcW w:type="dxa" w:w="1944"/>
+          </w:tcPr>
+          <w:p>
+            <w:r>
+              <w:t>1 January 2007?4 August 2026</w:t>
+            </w:r>
+          </w:p>
+        </w:tc>
+        <w:tc>
+          <w:tcPr>
+            <w:tcW w:type="dxa" w:w="1728"/>
+          </w:tcPr>
+          <w:p>
+            <w:r>
+              <w:rPr>
+                <w:sz w:val="17"/>
+              </w:rPr>
+              <w:t>4 August 2026</w:t>
+            </w:r>
+          </w:p>
+        </w:tc>
+      </w:tr>
+      <w:tr>
+        <w:tc>
+          <w:tcPr>
+            <w:tcW w:type="dxa" w:w="1944"/>
+          </w:tcPr>
+          <w:p>
+            <w:r>
+              <w:rPr>
+                <w:sz w:val="17"/>
+              </w:rPr>
+              <w:t>Google Scholar</w:t>
+            </w:r>
+          </w:p>
+        </w:tc>
+        <w:tc>
+          <w:tcPr>
+            <w:tcW w:type="dxa" w:w="7560"/>
+          </w:tcPr>
+          <w:p>
+            <w:r>
+              <w:rPr>
+                <w:sz w:val="17"/>
+              </w:rPr>
+              <w:t>"person re-identification" OR "person re-ID" combined with (dataset OR benchmark OR "evaluation protocol") and (infrared OR UAV OR aerial OR multimodal OR "mixed gallery" OR "mixed-source" OR "unified retrieval" OR "any-scenario")</w:t>
+            </w:r>
+          </w:p>
+        </w:tc>
+        <w:tc>
+          <w:tcPr>
+            <w:tcW w:type="dxa" w:w="1944"/>
+          </w:tcPr>
+          <w:p>
+            <w:r>
+              <w:t>1 January 2007?4 August 2026</w:t>
+            </w:r>
+          </w:p>
+        </w:tc>
+        <w:tc>
+          <w:tcPr>
+            <w:tcW w:type="dxa" w:w="1728"/>
+          </w:tcPr>
+          <w:p>
+            <w:r>
+              <w:rPr>
+                <w:sz w:val="17"/>
+              </w:rPr>
+              <w:t>4 August 2026</w:t>
+            </w:r>
+          </w:p>
+        </w:tc>
+      </w:tr>
+    </w:tbl>
     <w:p>
       <w:pPr>
         <w:pStyle w:val="Heading1"/>
       </w:pPr>
       <w:r>
-        <w:t>?? A ???????????</w:t>
+        <w:t>附录 A 代表性数据集结构化主表</w:t>
       </w:r>
     </w:p>
     <w:p>
       <w:r>
-        <w:t>??????????????????/??????? Query?Gallery ?????????????????? E?</w:t>
+        <w:t>下表用于保证正文主线之外的数据字段可追踪。数据规模和采集条件优先依据原始数据集论文、官方项目页面或正式版本核验；对于原始论文和官方来源均未报告的信息，标记为“未报告”或“未能核验”，不以推测补齐。</w:t>
       </w:r>
     </w:p>
     <w:p>
       <w:r>
-        <w:t>? A1 ????????????</w:t>
+        <w:t>表A1. 代表性数据集结构化主表。</w:t>
       </w:r>
     </w:p>
     <w:tbl>
@@ -4337,23 +4581,27 @@
         </w:tc>
       </w:tr>
     </w:tbl>
-    <w:p/>
+    <w:p>
+      <w:r>
+        <w:t>对于CUHK03、SYSU-MM01等存在原始统计与常用评测版本差异的数据集，表A1保留数据内容层面的版本说明；具体训练—测试划分、Query–Gallery构造、检索方向、图库混合状态和过滤规则统一记录于附录 E。MP-ReID与WHU-MARS等多来源数据集也按同一原则区分数据内容与评价协议。</w:t>
+      </w:r>
+    </w:p>
     <w:p>
       <w:pPr>
         <w:pStyle w:val="Heading1"/>
       </w:pPr>
       <w:r>
-        <w:t>?? B ???????????</w:t>
+        <w:t>附录 B 代表性方法—证据注册表</w:t>
       </w:r>
     </w:p>
     <w:p>
       <w:r>
-        <w:t>???????????????????????????????</w:t>
+        <w:t>表B1记录代表性方法的原始设计目标、原始基准、后续复评设置、参数共享方式、场景标签使用情况以及直接证据边界。后续基准中的基线结果不改变方法最初的任务定位。</w:t>
       </w:r>
     </w:p>
     <w:p>
       <w:r>
-        <w:t>? B1 ????????????</w:t>
+        <w:t>表 B1. 代表性方法—证据注册表。</w:t>
       </w:r>
     </w:p>
     <w:tbl>
@@ -5248,15 +5496,8 @@
             <w:tcW w:type="dxa" w:w="1152"/>
           </w:tcPr>
           <w:p>
-            <w:pPr>
-              <w:jc w:val="center"/>
-            </w:pPr>
-            <w:r>
-              <w:rPr>
-                <w:b w:val="0"/>
-                <w:sz w:val="14"/>
-              </w:rPr>
-              <w:t>Sometimes</w:t>
+            <w:r>
+              <w:t>Protocol-dependent</w:t>
             </w:r>
           </w:p>
         </w:tc>
@@ -5265,15 +5506,8 @@
             <w:tcW w:type="dxa" w:w="1152"/>
           </w:tcPr>
           <w:p>
-            <w:pPr>
-              <w:jc w:val="center"/>
-            </w:pPr>
-            <w:r>
-              <w:rPr>
-                <w:b w:val="0"/>
-                <w:sz w:val="14"/>
-              </w:rPr>
-              <w:t>Sometimes</w:t>
+            <w:r>
+              <w:t>Protocol-dependent</w:t>
             </w:r>
           </w:p>
         </w:tc>
@@ -7179,17 +7413,17 @@
         <w:pStyle w:val="Heading1"/>
       </w:pPr>
       <w:r>
-        <w:t>?? C ??????????</w:t>
+        <w:t>附录 C 数据可用性与伦理字段</w:t>
       </w:r>
     </w:p>
     <w:p>
       <w:r>
-        <w:t>??????????????????????/??????????????????????????????????????????????????????????????</w:t>
+        <w:t>表C1按数据集记录可用性、数据集许可证或协议、伦理/知情同意、匿名化、使用限制、维护状态和可用性核查日期，并新增 Evidence source、Official URL or archived URL 和 Source version/date 三列。Evidence source 列列出支持字段判断的原始论文、官方项目页、官方仓库、发布/使用协议或存档来源；URL 列记录相应入口。对于所列核验来源未明确报告的信息，统一标记为「在所列核验来源中未发现明确说明（核查至2026-09-04）」，该表述不等同于该事项不存在。URL 可达性和申请状态仅反映最后核查日的页面状态。</w:t>
       </w:r>
     </w:p>
     <w:p>
       <w:r>
-        <w:t>? C1 ????????????????????</w:t>
+        <w:t>表 C1. 代表性数据集的可用性、许可与伦理注册表。</w:t>
       </w:r>
     </w:p>
     <w:tbl>
@@ -7451,15 +7685,8 @@
             <w:tcW w:type="dxa" w:w="943"/>
           </w:tcPr>
           <w:p>
-            <w:pPr>
-              <w:jc w:val="center"/>
-            </w:pPr>
-            <w:r>
-              <w:rPr>
-                <w:b w:val="0"/>
-                <w:sz w:val="14"/>
-              </w:rPr>
-              <w:t>No explicit dataset license found in listed evidence sources (checked 2026-09-04).</w:t>
+            <w:r>
+              <w:t>Not explicitly reported in the listed evidence sources (checked 2026-09-04).</w:t>
             </w:r>
           </w:p>
         </w:tc>
@@ -7468,15 +7695,8 @@
             <w:tcW w:type="dxa" w:w="943"/>
           </w:tcPr>
           <w:p>
-            <w:pPr>
-              <w:jc w:val="center"/>
-            </w:pPr>
-            <w:r>
-              <w:rPr>
-                <w:b w:val="0"/>
-                <w:sz w:val="14"/>
-              </w:rPr>
-              <w:t>No explicit statement found in listed evidence sources (checked 2026-09-04).</w:t>
+            <w:r>
+              <w:t>Not explicitly reported in the listed evidence sources (checked 2026-09-04).</w:t>
             </w:r>
           </w:p>
         </w:tc>
@@ -7485,15 +7705,8 @@
             <w:tcW w:type="dxa" w:w="943"/>
           </w:tcPr>
           <w:p>
-            <w:pPr>
-              <w:jc w:val="center"/>
-            </w:pPr>
-            <w:r>
-              <w:rPr>
-                <w:b w:val="0"/>
-                <w:sz w:val="14"/>
-              </w:rPr>
-              <w:t>No explicit statement found in listed evidence sources (checked 2026-09-04).</w:t>
+            <w:r>
+              <w:t>Not explicitly reported in the listed evidence sources (checked 2026-09-04).</w:t>
             </w:r>
           </w:p>
         </w:tc>
@@ -7502,15 +7715,8 @@
             <w:tcW w:type="dxa" w:w="943"/>
           </w:tcPr>
           <w:p>
-            <w:pPr>
-              <w:jc w:val="center"/>
-            </w:pPr>
-            <w:r>
-              <w:rPr>
-                <w:b w:val="0"/>
-                <w:sz w:val="14"/>
-              </w:rPr>
-              <w:t>No explicit restriction found in listed evidence sources (checked 2026-09-04).</w:t>
+            <w:r>
+              <w:t>Not explicitly reported in the listed evidence sources (checked 2026-09-04).</w:t>
             </w:r>
           </w:p>
         </w:tc>
@@ -7640,15 +7846,8 @@
             <w:tcW w:type="dxa" w:w="943"/>
           </w:tcPr>
           <w:p>
-            <w:pPr>
-              <w:jc w:val="center"/>
-            </w:pPr>
-            <w:r>
-              <w:rPr>
-                <w:b w:val="0"/>
-                <w:sz w:val="14"/>
-              </w:rPr>
-              <w:t>No explicit dataset license found in listed evidence sources (checked 2026-09-04).</w:t>
+            <w:r>
+              <w:t>Not explicitly reported in the listed evidence sources (checked 2026-09-04).</w:t>
             </w:r>
           </w:p>
         </w:tc>
@@ -7657,15 +7856,8 @@
             <w:tcW w:type="dxa" w:w="943"/>
           </w:tcPr>
           <w:p>
-            <w:pPr>
-              <w:jc w:val="center"/>
-            </w:pPr>
-            <w:r>
-              <w:rPr>
-                <w:b w:val="0"/>
-                <w:sz w:val="14"/>
-              </w:rPr>
-              <w:t>No explicit statement found in listed evidence sources (checked 2026-09-04).</w:t>
+            <w:r>
+              <w:t>Not explicitly reported in the listed evidence sources (checked 2026-09-04).</w:t>
             </w:r>
           </w:p>
         </w:tc>
@@ -7674,15 +7866,8 @@
             <w:tcW w:type="dxa" w:w="943"/>
           </w:tcPr>
           <w:p>
-            <w:pPr>
-              <w:jc w:val="center"/>
-            </w:pPr>
-            <w:r>
-              <w:rPr>
-                <w:b w:val="0"/>
-                <w:sz w:val="14"/>
-              </w:rPr>
-              <w:t>No explicit statement found in listed evidence sources (checked 2026-09-04).</w:t>
+            <w:r>
+              <w:t>Not explicitly reported in the listed evidence sources (checked 2026-09-04).</w:t>
             </w:r>
           </w:p>
         </w:tc>
@@ -7691,15 +7876,8 @@
             <w:tcW w:type="dxa" w:w="943"/>
           </w:tcPr>
           <w:p>
-            <w:pPr>
-              <w:jc w:val="center"/>
-            </w:pPr>
-            <w:r>
-              <w:rPr>
-                <w:b w:val="0"/>
-                <w:sz w:val="14"/>
-              </w:rPr>
-              <w:t>No explicit restriction found in listed evidence sources (checked 2026-09-04).</w:t>
+            <w:r>
+              <w:t>Not explicitly reported in the listed evidence sources (checked 2026-09-04).</w:t>
             </w:r>
           </w:p>
         </w:tc>
@@ -7846,15 +8024,8 @@
             <w:tcW w:type="dxa" w:w="943"/>
           </w:tcPr>
           <w:p>
-            <w:pPr>
-              <w:jc w:val="center"/>
-            </w:pPr>
-            <w:r>
-              <w:rPr>
-                <w:b w:val="0"/>
-                <w:sz w:val="14"/>
-              </w:rPr>
-              <w:t>No explicit statement found in listed evidence sources (checked 2026-09-04).</w:t>
+            <w:r>
+              <w:t>Not explicitly reported in the listed evidence sources (checked 2026-09-04).</w:t>
             </w:r>
           </w:p>
         </w:tc>
@@ -7863,15 +8034,8 @@
             <w:tcW w:type="dxa" w:w="943"/>
           </w:tcPr>
           <w:p>
-            <w:pPr>
-              <w:jc w:val="center"/>
-            </w:pPr>
-            <w:r>
-              <w:rPr>
-                <w:b w:val="0"/>
-                <w:sz w:val="14"/>
-              </w:rPr>
-              <w:t>No explicit statement found in listed evidence sources (checked 2026-09-04).</w:t>
+            <w:r>
+              <w:t>Not explicitly reported in the listed evidence sources (checked 2026-09-04).</w:t>
             </w:r>
           </w:p>
         </w:tc>
@@ -8035,15 +8199,8 @@
             <w:tcW w:type="dxa" w:w="943"/>
           </w:tcPr>
           <w:p>
-            <w:pPr>
-              <w:jc w:val="center"/>
-            </w:pPr>
-            <w:r>
-              <w:rPr>
-                <w:b w:val="0"/>
-                <w:sz w:val="14"/>
-              </w:rPr>
-              <w:t>No explicit statement found in listed evidence sources (checked 2026-09-04).</w:t>
+            <w:r>
+              <w:t>Not explicitly reported in the listed evidence sources (checked 2026-09-04).</w:t>
             </w:r>
           </w:p>
         </w:tc>
@@ -8052,15 +8209,8 @@
             <w:tcW w:type="dxa" w:w="943"/>
           </w:tcPr>
           <w:p>
-            <w:pPr>
-              <w:jc w:val="center"/>
-            </w:pPr>
-            <w:r>
-              <w:rPr>
-                <w:b w:val="0"/>
-                <w:sz w:val="14"/>
-              </w:rPr>
-              <w:t>No explicit statement found in listed evidence sources (checked 2026-09-04).</w:t>
+            <w:r>
+              <w:t>Not explicitly reported in the listed evidence sources (checked 2026-09-04).</w:t>
             </w:r>
           </w:p>
         </w:tc>
@@ -8207,15 +8357,8 @@
             <w:tcW w:type="dxa" w:w="943"/>
           </w:tcPr>
           <w:p>
-            <w:pPr>
-              <w:jc w:val="center"/>
-            </w:pPr>
-            <w:r>
-              <w:rPr>
-                <w:b w:val="0"/>
-                <w:sz w:val="14"/>
-              </w:rPr>
-              <w:t>No explicit public license found in listed evidence sources (checked 2026-09-04).</w:t>
+            <w:r>
+              <w:t>Not explicitly reported in the listed evidence sources (checked 2026-09-04).</w:t>
             </w:r>
           </w:p>
         </w:tc>
@@ -8224,15 +8367,8 @@
             <w:tcW w:type="dxa" w:w="943"/>
           </w:tcPr>
           <w:p>
-            <w:pPr>
-              <w:jc w:val="center"/>
-            </w:pPr>
-            <w:r>
-              <w:rPr>
-                <w:b w:val="0"/>
-                <w:sz w:val="14"/>
-              </w:rPr>
-              <w:t>No explicit statement found in listed evidence sources (checked 2026-09-04).</w:t>
+            <w:r>
+              <w:t>Not explicitly reported in the listed evidence sources (checked 2026-09-04).</w:t>
             </w:r>
           </w:p>
         </w:tc>
@@ -8241,15 +8377,8 @@
             <w:tcW w:type="dxa" w:w="943"/>
           </w:tcPr>
           <w:p>
-            <w:pPr>
-              <w:jc w:val="center"/>
-            </w:pPr>
-            <w:r>
-              <w:rPr>
-                <w:b w:val="0"/>
-                <w:sz w:val="14"/>
-              </w:rPr>
-              <w:t>No explicit statement found in listed evidence sources (checked 2026-09-04).</w:t>
+            <w:r>
+              <w:t>Not explicitly reported in the listed evidence sources (checked 2026-09-04).</w:t>
             </w:r>
           </w:p>
         </w:tc>
@@ -8258,15 +8387,8 @@
             <w:tcW w:type="dxa" w:w="943"/>
           </w:tcPr>
           <w:p>
-            <w:pPr>
-              <w:jc w:val="center"/>
-            </w:pPr>
-            <w:r>
-              <w:rPr>
-                <w:b w:val="0"/>
-                <w:sz w:val="14"/>
-              </w:rPr>
-              <w:t>No explicit statement found in listed evidence sources (checked 2026-09-04).</w:t>
+            <w:r>
+              <w:t>Not explicitly reported in the listed evidence sources (checked 2026-09-04).</w:t>
             </w:r>
           </w:p>
         </w:tc>
@@ -8430,15 +8552,8 @@
             <w:tcW w:type="dxa" w:w="943"/>
           </w:tcPr>
           <w:p>
-            <w:pPr>
-              <w:jc w:val="center"/>
-            </w:pPr>
-            <w:r>
-              <w:rPr>
-                <w:b w:val="0"/>
-                <w:sz w:val="14"/>
-              </w:rPr>
-              <w:t>No explicit statement found in listed evidence sources (checked 2026-09-04).</w:t>
+            <w:r>
+              <w:t>Not explicitly reported in the listed evidence sources (checked 2026-09-04).</w:t>
             </w:r>
           </w:p>
         </w:tc>
@@ -8585,15 +8700,8 @@
             <w:tcW w:type="dxa" w:w="943"/>
           </w:tcPr>
           <w:p>
-            <w:pPr>
-              <w:jc w:val="center"/>
-            </w:pPr>
-            <w:r>
-              <w:rPr>
-                <w:b w:val="0"/>
-                <w:sz w:val="14"/>
-              </w:rPr>
-              <w:t>No explicit dataset-specific license found in listed evidence sources (checked 2026-09-04).</w:t>
+            <w:r>
+              <w:t>Not explicitly reported in the listed evidence sources (checked 2026-09-04).</w:t>
             </w:r>
           </w:p>
         </w:tc>
@@ -8602,15 +8710,8 @@
             <w:tcW w:type="dxa" w:w="943"/>
           </w:tcPr>
           <w:p>
-            <w:pPr>
-              <w:jc w:val="center"/>
-            </w:pPr>
-            <w:r>
-              <w:rPr>
-                <w:b w:val="0"/>
-                <w:sz w:val="14"/>
-              </w:rPr>
-              <w:t>No explicit statement found in listed evidence sources (checked 2026-09-04).</w:t>
+            <w:r>
+              <w:t>Not explicitly reported in the listed evidence sources (checked 2026-09-04).</w:t>
             </w:r>
           </w:p>
         </w:tc>
@@ -8619,15 +8720,8 @@
             <w:tcW w:type="dxa" w:w="943"/>
           </w:tcPr>
           <w:p>
-            <w:pPr>
-              <w:jc w:val="center"/>
-            </w:pPr>
-            <w:r>
-              <w:rPr>
-                <w:b w:val="0"/>
-                <w:sz w:val="14"/>
-              </w:rPr>
-              <w:t>No explicit statement found in listed evidence sources (checked 2026-09-04).</w:t>
+            <w:r>
+              <w:t>Not explicitly reported in the listed evidence sources (checked 2026-09-04).</w:t>
             </w:r>
           </w:p>
         </w:tc>
@@ -8636,15 +8730,8 @@
             <w:tcW w:type="dxa" w:w="943"/>
           </w:tcPr>
           <w:p>
-            <w:pPr>
-              <w:jc w:val="center"/>
-            </w:pPr>
-            <w:r>
-              <w:rPr>
-                <w:b w:val="0"/>
-                <w:sz w:val="14"/>
-              </w:rPr>
-              <w:t>No explicit dataset-use restriction found in listed evidence sources (checked 2026-09-04).</w:t>
+            <w:r>
+              <w:t>Not explicitly reported in the listed evidence sources (checked 2026-09-04).</w:t>
             </w:r>
           </w:p>
         </w:tc>
@@ -8774,15 +8861,8 @@
             <w:tcW w:type="dxa" w:w="943"/>
           </w:tcPr>
           <w:p>
-            <w:pPr>
-              <w:jc w:val="center"/>
-            </w:pPr>
-            <w:r>
-              <w:rPr>
-                <w:b w:val="0"/>
-                <w:sz w:val="14"/>
-              </w:rPr>
-              <w:t>No explicit public license found in listed evidence sources (checked 2026-09-04).</w:t>
+            <w:r>
+              <w:t>Not explicitly reported in the listed evidence sources (checked 2026-09-04).</w:t>
             </w:r>
           </w:p>
         </w:tc>
@@ -8791,15 +8871,8 @@
             <w:tcW w:type="dxa" w:w="943"/>
           </w:tcPr>
           <w:p>
-            <w:pPr>
-              <w:jc w:val="center"/>
-            </w:pPr>
-            <w:r>
-              <w:rPr>
-                <w:b w:val="0"/>
-                <w:sz w:val="14"/>
-              </w:rPr>
-              <w:t>No explicit statement found in listed evidence sources (checked 2026-09-04).</w:t>
+            <w:r>
+              <w:t>Not explicitly reported in the listed evidence sources (checked 2026-09-04).</w:t>
             </w:r>
           </w:p>
         </w:tc>
@@ -8808,15 +8881,8 @@
             <w:tcW w:type="dxa" w:w="943"/>
           </w:tcPr>
           <w:p>
-            <w:pPr>
-              <w:jc w:val="center"/>
-            </w:pPr>
-            <w:r>
-              <w:rPr>
-                <w:b w:val="0"/>
-                <w:sz w:val="14"/>
-              </w:rPr>
-              <w:t>No explicit statement found in listed evidence sources (checked 2026-09-04).</w:t>
+            <w:r>
+              <w:t>Not explicitly reported in the listed evidence sources (checked 2026-09-04).</w:t>
             </w:r>
           </w:p>
         </w:tc>
@@ -8825,15 +8891,8 @@
             <w:tcW w:type="dxa" w:w="943"/>
           </w:tcPr>
           <w:p>
-            <w:pPr>
-              <w:jc w:val="center"/>
-            </w:pPr>
-            <w:r>
-              <w:rPr>
-                <w:b w:val="0"/>
-                <w:sz w:val="14"/>
-              </w:rPr>
-              <w:t>No explicit restriction found in listed evidence sources (checked 2026-09-04).</w:t>
+            <w:r>
+              <w:t>Not explicitly reported in the listed evidence sources (checked 2026-09-04).</w:t>
             </w:r>
           </w:p>
         </w:tc>
@@ -8963,15 +9022,8 @@
             <w:tcW w:type="dxa" w:w="943"/>
           </w:tcPr>
           <w:p>
-            <w:pPr>
-              <w:jc w:val="center"/>
-            </w:pPr>
-            <w:r>
-              <w:rPr>
-                <w:b w:val="0"/>
-                <w:sz w:val="14"/>
-              </w:rPr>
-              <w:t>No explicit dataset license found in listed evidence sources (checked 2026-09-04).</w:t>
+            <w:r>
+              <w:t>Not explicitly reported in the listed evidence sources (checked 2026-09-04).</w:t>
             </w:r>
           </w:p>
         </w:tc>
@@ -9014,15 +9066,8 @@
             <w:tcW w:type="dxa" w:w="943"/>
           </w:tcPr>
           <w:p>
-            <w:pPr>
-              <w:jc w:val="center"/>
-            </w:pPr>
-            <w:r>
-              <w:rPr>
-                <w:b w:val="0"/>
-                <w:sz w:val="14"/>
-              </w:rPr>
-              <w:t>No explicit dataset-use restriction found in listed evidence sources (checked 2026-09-04).</w:t>
+            <w:r>
+              <w:t>Not explicitly reported in the listed evidence sources (checked 2026-09-04).</w:t>
             </w:r>
           </w:p>
         </w:tc>
@@ -9358,15 +9403,8 @@
             <w:tcW w:type="dxa" w:w="943"/>
           </w:tcPr>
           <w:p>
-            <w:pPr>
-              <w:jc w:val="center"/>
-            </w:pPr>
-            <w:r>
-              <w:rPr>
-                <w:b w:val="0"/>
-                <w:sz w:val="14"/>
-              </w:rPr>
-              <w:t>No explicit statement found in listed evidence sources (checked 2026-09-04).</w:t>
+            <w:r>
+              <w:t>Not explicitly reported in the listed evidence sources (checked 2026-09-04).</w:t>
             </w:r>
           </w:p>
         </w:tc>
@@ -9375,15 +9413,8 @@
             <w:tcW w:type="dxa" w:w="943"/>
           </w:tcPr>
           <w:p>
-            <w:pPr>
-              <w:jc w:val="center"/>
-            </w:pPr>
-            <w:r>
-              <w:rPr>
-                <w:b w:val="0"/>
-                <w:sz w:val="14"/>
-              </w:rPr>
-              <w:t>No explicit statement found in listed evidence sources (checked 2026-09-04).</w:t>
+            <w:r>
+              <w:t>Not explicitly reported in the listed evidence sources (checked 2026-09-04).</w:t>
             </w:r>
           </w:p>
         </w:tc>
@@ -9564,15 +9595,8 @@
             <w:tcW w:type="dxa" w:w="943"/>
           </w:tcPr>
           <w:p>
-            <w:pPr>
-              <w:jc w:val="center"/>
-            </w:pPr>
-            <w:r>
-              <w:rPr>
-                <w:b w:val="0"/>
-                <w:sz w:val="14"/>
-              </w:rPr>
-              <w:t>No explicit statement found in listed evidence sources (checked 2026-09-04).</w:t>
+            <w:r>
+              <w:t>Not explicitly reported in the listed evidence sources (checked 2026-09-04).</w:t>
             </w:r>
           </w:p>
         </w:tc>
@@ -9736,15 +9760,8 @@
             <w:tcW w:type="dxa" w:w="943"/>
           </w:tcPr>
           <w:p>
-            <w:pPr>
-              <w:jc w:val="center"/>
-            </w:pPr>
-            <w:r>
-              <w:rPr>
-                <w:b w:val="0"/>
-                <w:sz w:val="14"/>
-              </w:rPr>
-              <w:t>No explicit statement found in listed evidence sources (checked 2026-09-04).</w:t>
+            <w:r>
+              <w:t>Not explicitly reported in the listed evidence sources (checked 2026-09-04).</w:t>
             </w:r>
           </w:p>
         </w:tc>
@@ -10097,15 +10114,8 @@
             <w:tcW w:type="dxa" w:w="943"/>
           </w:tcPr>
           <w:p>
-            <w:pPr>
-              <w:jc w:val="center"/>
-            </w:pPr>
-            <w:r>
-              <w:rPr>
-                <w:b w:val="0"/>
-                <w:sz w:val="14"/>
-              </w:rPr>
-              <w:t>No explicit dataset license found in listed evidence sources (checked 2026-09-04).</w:t>
+            <w:r>
+              <w:t>Not explicitly reported in the listed evidence sources (checked 2026-09-04).</w:t>
             </w:r>
           </w:p>
         </w:tc>
@@ -10114,15 +10124,8 @@
             <w:tcW w:type="dxa" w:w="943"/>
           </w:tcPr>
           <w:p>
-            <w:pPr>
-              <w:jc w:val="center"/>
-            </w:pPr>
-            <w:r>
-              <w:rPr>
-                <w:b w:val="0"/>
-                <w:sz w:val="14"/>
-              </w:rPr>
-              <w:t>No explicit statement found in listed evidence sources (checked 2026-09-04).</w:t>
+            <w:r>
+              <w:t>Not explicitly reported in the listed evidence sources (checked 2026-09-04).</w:t>
             </w:r>
           </w:p>
         </w:tc>
@@ -10131,15 +10134,8 @@
             <w:tcW w:type="dxa" w:w="943"/>
           </w:tcPr>
           <w:p>
-            <w:pPr>
-              <w:jc w:val="center"/>
-            </w:pPr>
-            <w:r>
-              <w:rPr>
-                <w:b w:val="0"/>
-                <w:sz w:val="14"/>
-              </w:rPr>
-              <w:t>No explicit statement found in listed evidence sources (checked 2026-09-04).</w:t>
+            <w:r>
+              <w:t>Not explicitly reported in the listed evidence sources (checked 2026-09-04).</w:t>
             </w:r>
           </w:p>
         </w:tc>
@@ -10148,15 +10144,8 @@
             <w:tcW w:type="dxa" w:w="943"/>
           </w:tcPr>
           <w:p>
-            <w:pPr>
-              <w:jc w:val="center"/>
-            </w:pPr>
-            <w:r>
-              <w:rPr>
-                <w:b w:val="0"/>
-                <w:sz w:val="14"/>
-              </w:rPr>
-              <w:t>No explicit restriction found in listed evidence sources (checked 2026-09-04).</w:t>
+            <w:r>
+              <w:t>Not explicitly reported in the listed evidence sources (checked 2026-09-04).</w:t>
             </w:r>
           </w:p>
         </w:tc>
@@ -10286,15 +10275,8 @@
             <w:tcW w:type="dxa" w:w="943"/>
           </w:tcPr>
           <w:p>
-            <w:pPr>
-              <w:jc w:val="center"/>
-            </w:pPr>
-            <w:r>
-              <w:rPr>
-                <w:b w:val="0"/>
-                <w:sz w:val="14"/>
-              </w:rPr>
-              <w:t>No explicit dataset license found in listed evidence sources (checked 2026-09-04).</w:t>
+            <w:r>
+              <w:t>Not explicitly reported in the listed evidence sources (checked 2026-09-04).</w:t>
             </w:r>
           </w:p>
         </w:tc>
@@ -10303,15 +10285,8 @@
             <w:tcW w:type="dxa" w:w="943"/>
           </w:tcPr>
           <w:p>
-            <w:pPr>
-              <w:jc w:val="center"/>
-            </w:pPr>
-            <w:r>
-              <w:rPr>
-                <w:b w:val="0"/>
-                <w:sz w:val="14"/>
-              </w:rPr>
-              <w:t>No explicit statement found in listed evidence sources (checked 2026-09-04).</w:t>
+            <w:r>
+              <w:t>Not explicitly reported in the listed evidence sources (checked 2026-09-04).</w:t>
             </w:r>
           </w:p>
         </w:tc>
@@ -10320,15 +10295,8 @@
             <w:tcW w:type="dxa" w:w="943"/>
           </w:tcPr>
           <w:p>
-            <w:pPr>
-              <w:jc w:val="center"/>
-            </w:pPr>
-            <w:r>
-              <w:rPr>
-                <w:b w:val="0"/>
-                <w:sz w:val="14"/>
-              </w:rPr>
-              <w:t>No explicit statement found in listed evidence sources (checked 2026-09-04).</w:t>
+            <w:r>
+              <w:t>Not explicitly reported in the listed evidence sources (checked 2026-09-04).</w:t>
             </w:r>
           </w:p>
         </w:tc>
@@ -10337,15 +10305,8 @@
             <w:tcW w:type="dxa" w:w="943"/>
           </w:tcPr>
           <w:p>
-            <w:pPr>
-              <w:jc w:val="center"/>
-            </w:pPr>
-            <w:r>
-              <w:rPr>
-                <w:b w:val="0"/>
-                <w:sz w:val="14"/>
-              </w:rPr>
-              <w:t>No explicit restriction found in listed evidence sources (checked 2026-09-04).</w:t>
+            <w:r>
+              <w:t>Not explicitly reported in the listed evidence sources (checked 2026-09-04).</w:t>
             </w:r>
           </w:p>
         </w:tc>
@@ -10492,15 +10453,8 @@
             <w:tcW w:type="dxa" w:w="943"/>
           </w:tcPr>
           <w:p>
-            <w:pPr>
-              <w:jc w:val="center"/>
-            </w:pPr>
-            <w:r>
-              <w:rPr>
-                <w:b w:val="0"/>
-                <w:sz w:val="14"/>
-              </w:rPr>
-              <w:t>No explicit statement found in listed evidence sources (checked 2026-09-04).</w:t>
+            <w:r>
+              <w:t>Not explicitly reported in the listed evidence sources (checked 2026-09-04).</w:t>
             </w:r>
           </w:p>
         </w:tc>
@@ -10509,15 +10463,8 @@
             <w:tcW w:type="dxa" w:w="943"/>
           </w:tcPr>
           <w:p>
-            <w:pPr>
-              <w:jc w:val="center"/>
-            </w:pPr>
-            <w:r>
-              <w:rPr>
-                <w:b w:val="0"/>
-                <w:sz w:val="14"/>
-              </w:rPr>
-              <w:t>No explicit statement found in listed evidence sources (checked 2026-09-04).</w:t>
+            <w:r>
+              <w:t>Not explicitly reported in the listed evidence sources (checked 2026-09-04).</w:t>
             </w:r>
           </w:p>
         </w:tc>
@@ -10698,15 +10645,8 @@
             <w:tcW w:type="dxa" w:w="943"/>
           </w:tcPr>
           <w:p>
-            <w:pPr>
-              <w:jc w:val="center"/>
-            </w:pPr>
-            <w:r>
-              <w:rPr>
-                <w:b w:val="0"/>
-                <w:sz w:val="14"/>
-              </w:rPr>
-              <w:t>No explicit statement found in listed evidence sources (checked 2026-09-04).</w:t>
+            <w:r>
+              <w:t>Not explicitly reported in the listed evidence sources (checked 2026-09-04).</w:t>
             </w:r>
           </w:p>
         </w:tc>
@@ -10853,15 +10793,8 @@
             <w:tcW w:type="dxa" w:w="943"/>
           </w:tcPr>
           <w:p>
-            <w:pPr>
-              <w:jc w:val="center"/>
-            </w:pPr>
-            <w:r>
-              <w:rPr>
-                <w:b w:val="0"/>
-                <w:sz w:val="14"/>
-              </w:rPr>
-              <w:t>No explicit dataset license found in listed evidence sources (checked 2026-09-04).</w:t>
+            <w:r>
+              <w:t>Not explicitly reported in the listed evidence sources (checked 2026-09-04).</w:t>
             </w:r>
           </w:p>
         </w:tc>
@@ -10870,15 +10803,8 @@
             <w:tcW w:type="dxa" w:w="943"/>
           </w:tcPr>
           <w:p>
-            <w:pPr>
-              <w:jc w:val="center"/>
-            </w:pPr>
-            <w:r>
-              <w:rPr>
-                <w:b w:val="0"/>
-                <w:sz w:val="14"/>
-              </w:rPr>
-              <w:t>No explicit statement found in listed evidence sources (checked 2026-09-04).</w:t>
+            <w:r>
+              <w:t>Not explicitly reported in the listed evidence sources (checked 2026-09-04).</w:t>
             </w:r>
           </w:p>
         </w:tc>
@@ -10887,15 +10813,8 @@
             <w:tcW w:type="dxa" w:w="943"/>
           </w:tcPr>
           <w:p>
-            <w:pPr>
-              <w:jc w:val="center"/>
-            </w:pPr>
-            <w:r>
-              <w:rPr>
-                <w:b w:val="0"/>
-                <w:sz w:val="14"/>
-              </w:rPr>
-              <w:t>No explicit statement found in listed evidence sources (checked 2026-09-04).</w:t>
+            <w:r>
+              <w:t>Not explicitly reported in the listed evidence sources (checked 2026-09-04).</w:t>
             </w:r>
           </w:p>
         </w:tc>
@@ -10904,15 +10823,8 @@
             <w:tcW w:type="dxa" w:w="943"/>
           </w:tcPr>
           <w:p>
-            <w:pPr>
-              <w:jc w:val="center"/>
-            </w:pPr>
-            <w:r>
-              <w:rPr>
-                <w:b w:val="0"/>
-                <w:sz w:val="14"/>
-              </w:rPr>
-              <w:t>No explicit restriction found in listed evidence sources (checked 2026-09-04).</w:t>
+            <w:r>
+              <w:t>Not explicitly reported in the listed evidence sources (checked 2026-09-04).</w:t>
             </w:r>
           </w:p>
         </w:tc>
@@ -11042,15 +10954,8 @@
             <w:tcW w:type="dxa" w:w="943"/>
           </w:tcPr>
           <w:p>
-            <w:pPr>
-              <w:jc w:val="center"/>
-            </w:pPr>
-            <w:r>
-              <w:rPr>
-                <w:b w:val="0"/>
-                <w:sz w:val="14"/>
-              </w:rPr>
-              <w:t>No explicit dataset license found in listed evidence sources (checked 2026-09-04).</w:t>
+            <w:r>
+              <w:t>Not explicitly reported in the listed evidence sources (checked 2026-09-04).</w:t>
             </w:r>
           </w:p>
         </w:tc>
@@ -11059,15 +10964,8 @@
             <w:tcW w:type="dxa" w:w="943"/>
           </w:tcPr>
           <w:p>
-            <w:pPr>
-              <w:jc w:val="center"/>
-            </w:pPr>
-            <w:r>
-              <w:rPr>
-                <w:b w:val="0"/>
-                <w:sz w:val="14"/>
-              </w:rPr>
-              <w:t>No explicit statement found in listed evidence sources (checked 2026-09-04).</w:t>
+            <w:r>
+              <w:t>Not explicitly reported in the listed evidence sources (checked 2026-09-04).</w:t>
             </w:r>
           </w:p>
         </w:tc>
@@ -11076,15 +10974,8 @@
             <w:tcW w:type="dxa" w:w="943"/>
           </w:tcPr>
           <w:p>
-            <w:pPr>
-              <w:jc w:val="center"/>
-            </w:pPr>
-            <w:r>
-              <w:rPr>
-                <w:b w:val="0"/>
-                <w:sz w:val="14"/>
-              </w:rPr>
-              <w:t>No explicit statement found in listed evidence sources (checked 2026-09-04).</w:t>
+            <w:r>
+              <w:t>Not explicitly reported in the listed evidence sources (checked 2026-09-04).</w:t>
             </w:r>
           </w:p>
         </w:tc>
@@ -11093,15 +10984,8 @@
             <w:tcW w:type="dxa" w:w="943"/>
           </w:tcPr>
           <w:p>
-            <w:pPr>
-              <w:jc w:val="center"/>
-            </w:pPr>
-            <w:r>
-              <w:rPr>
-                <w:b w:val="0"/>
-                <w:sz w:val="14"/>
-              </w:rPr>
-              <w:t>No explicit restriction found in listed evidence sources (checked 2026-09-04).</w:t>
+            <w:r>
+              <w:t>Not explicitly reported in the listed evidence sources (checked 2026-09-04).</w:t>
             </w:r>
           </w:p>
         </w:tc>
@@ -11248,15 +11132,8 @@
             <w:tcW w:type="dxa" w:w="943"/>
           </w:tcPr>
           <w:p>
-            <w:pPr>
-              <w:jc w:val="center"/>
-            </w:pPr>
-            <w:r>
-              <w:rPr>
-                <w:b w:val="0"/>
-                <w:sz w:val="14"/>
-              </w:rPr>
-              <w:t>No explicit statement found in listed evidence sources (checked 2026-09-04).</w:t>
+            <w:r>
+              <w:t>Not explicitly reported in the listed evidence sources (checked 2026-09-04).</w:t>
             </w:r>
           </w:p>
         </w:tc>
@@ -11265,15 +11142,8 @@
             <w:tcW w:type="dxa" w:w="943"/>
           </w:tcPr>
           <w:p>
-            <w:pPr>
-              <w:jc w:val="center"/>
-            </w:pPr>
-            <w:r>
-              <w:rPr>
-                <w:b w:val="0"/>
-                <w:sz w:val="14"/>
-              </w:rPr>
-              <w:t>No explicit statement found in listed evidence sources (checked 2026-09-04).</w:t>
+            <w:r>
+              <w:t>Not explicitly reported in the listed evidence sources (checked 2026-09-04).</w:t>
             </w:r>
           </w:p>
         </w:tc>
@@ -11437,15 +11307,8 @@
             <w:tcW w:type="dxa" w:w="943"/>
           </w:tcPr>
           <w:p>
-            <w:pPr>
-              <w:jc w:val="center"/>
-            </w:pPr>
-            <w:r>
-              <w:rPr>
-                <w:b w:val="0"/>
-                <w:sz w:val="14"/>
-              </w:rPr>
-              <w:t>No explicit statement found in listed evidence sources (checked 2026-09-04).</w:t>
+            <w:r>
+              <w:t>Not explicitly reported in the listed evidence sources (checked 2026-09-04).</w:t>
             </w:r>
           </w:p>
         </w:tc>
@@ -11454,15 +11317,8 @@
             <w:tcW w:type="dxa" w:w="943"/>
           </w:tcPr>
           <w:p>
-            <w:pPr>
-              <w:jc w:val="center"/>
-            </w:pPr>
-            <w:r>
-              <w:rPr>
-                <w:b w:val="0"/>
-                <w:sz w:val="14"/>
-              </w:rPr>
-              <w:t>No explicit statement found in listed evidence sources (checked 2026-09-04).</w:t>
+            <w:r>
+              <w:t>Not explicitly reported in the listed evidence sources (checked 2026-09-04).</w:t>
             </w:r>
           </w:p>
         </w:tc>
@@ -11626,15 +11482,8 @@
             <w:tcW w:type="dxa" w:w="943"/>
           </w:tcPr>
           <w:p>
-            <w:pPr>
-              <w:jc w:val="center"/>
-            </w:pPr>
-            <w:r>
-              <w:rPr>
-                <w:b w:val="0"/>
-                <w:sz w:val="14"/>
-              </w:rPr>
-              <w:t>No explicit statement found in listed evidence sources (checked 2026-09-04).</w:t>
+            <w:r>
+              <w:t>Not explicitly reported in the listed evidence sources (checked 2026-09-04).</w:t>
             </w:r>
           </w:p>
         </w:tc>
@@ -11643,15 +11492,8 @@
             <w:tcW w:type="dxa" w:w="943"/>
           </w:tcPr>
           <w:p>
-            <w:pPr>
-              <w:jc w:val="center"/>
-            </w:pPr>
-            <w:r>
-              <w:rPr>
-                <w:b w:val="0"/>
-                <w:sz w:val="14"/>
-              </w:rPr>
-              <w:t>No explicit statement found in listed evidence sources (checked 2026-09-04).</w:t>
+            <w:r>
+              <w:t>Not explicitly reported in the listed evidence sources (checked 2026-09-04).</w:t>
             </w:r>
           </w:p>
         </w:tc>
@@ -11815,15 +11657,8 @@
             <w:tcW w:type="dxa" w:w="943"/>
           </w:tcPr>
           <w:p>
-            <w:pPr>
-              <w:jc w:val="center"/>
-            </w:pPr>
-            <w:r>
-              <w:rPr>
-                <w:b w:val="0"/>
-                <w:sz w:val="14"/>
-              </w:rPr>
-              <w:t>No explicit participant-consent statement found in listed evidence sources (checked 2026-09-04).</w:t>
+            <w:r>
+              <w:t>Not explicitly reported in the listed evidence sources (checked 2026-09-04).</w:t>
             </w:r>
           </w:p>
         </w:tc>
@@ -11832,15 +11667,8 @@
             <w:tcW w:type="dxa" w:w="943"/>
           </w:tcPr>
           <w:p>
-            <w:pPr>
-              <w:jc w:val="center"/>
-            </w:pPr>
-            <w:r>
-              <w:rPr>
-                <w:b w:val="0"/>
-                <w:sz w:val="14"/>
-              </w:rPr>
-              <w:t>No explicit statement found in listed evidence sources (checked 2026-09-04).</w:t>
+            <w:r>
+              <w:t>Not explicitly reported in the listed evidence sources (checked 2026-09-04).</w:t>
             </w:r>
           </w:p>
         </w:tc>
@@ -12193,15 +12021,8 @@
             <w:tcW w:type="dxa" w:w="943"/>
           </w:tcPr>
           <w:p>
-            <w:pPr>
-              <w:jc w:val="center"/>
-            </w:pPr>
-            <w:r>
-              <w:rPr>
-                <w:b w:val="0"/>
-                <w:sz w:val="14"/>
-              </w:rPr>
-              <w:t>No explicit participant-related statement found in listed evidence sources (checked 2026-09-04).</w:t>
+            <w:r>
+              <w:t>Not explicitly reported in the listed evidence sources (checked 2026-09-04).</w:t>
             </w:r>
           </w:p>
         </w:tc>
@@ -12365,15 +12186,8 @@
             <w:tcW w:type="dxa" w:w="943"/>
           </w:tcPr>
           <w:p>
-            <w:pPr>
-              <w:jc w:val="center"/>
-            </w:pPr>
-            <w:r>
-              <w:rPr>
-                <w:b w:val="0"/>
-                <w:sz w:val="14"/>
-              </w:rPr>
-              <w:t>No explicit dataset license found in listed evidence sources (checked 2026-09-04).</w:t>
+            <w:r>
+              <w:t>Not explicitly reported in the listed evidence sources (checked 2026-09-04).</w:t>
             </w:r>
           </w:p>
         </w:tc>
@@ -12382,15 +12196,8 @@
             <w:tcW w:type="dxa" w:w="943"/>
           </w:tcPr>
           <w:p>
-            <w:pPr>
-              <w:jc w:val="center"/>
-            </w:pPr>
-            <w:r>
-              <w:rPr>
-                <w:b w:val="0"/>
-                <w:sz w:val="14"/>
-              </w:rPr>
-              <w:t>No explicit statement found in listed evidence sources (checked 2026-09-04).</w:t>
+            <w:r>
+              <w:t>Not explicitly reported in the listed evidence sources (checked 2026-09-04).</w:t>
             </w:r>
           </w:p>
         </w:tc>
@@ -12399,15 +12206,8 @@
             <w:tcW w:type="dxa" w:w="943"/>
           </w:tcPr>
           <w:p>
-            <w:pPr>
-              <w:jc w:val="center"/>
-            </w:pPr>
-            <w:r>
-              <w:rPr>
-                <w:b w:val="0"/>
-                <w:sz w:val="14"/>
-              </w:rPr>
-              <w:t>No explicit statement found in listed evidence sources (checked 2026-09-04).</w:t>
+            <w:r>
+              <w:t>Not explicitly reported in the listed evidence sources (checked 2026-09-04).</w:t>
             </w:r>
           </w:p>
         </w:tc>
@@ -12416,15 +12216,8 @@
             <w:tcW w:type="dxa" w:w="943"/>
           </w:tcPr>
           <w:p>
-            <w:pPr>
-              <w:jc w:val="center"/>
-            </w:pPr>
-            <w:r>
-              <w:rPr>
-                <w:b w:val="0"/>
-                <w:sz w:val="14"/>
-              </w:rPr>
-              <w:t>No explicit dataset-use restriction found in listed evidence sources (checked 2026-09-04).</w:t>
+            <w:r>
+              <w:t>Not explicitly reported in the listed evidence sources (checked 2026-09-04).</w:t>
             </w:r>
           </w:p>
         </w:tc>
@@ -12554,15 +12347,8 @@
             <w:tcW w:type="dxa" w:w="943"/>
           </w:tcPr>
           <w:p>
-            <w:pPr>
-              <w:jc w:val="center"/>
-            </w:pPr>
-            <w:r>
-              <w:rPr>
-                <w:b w:val="0"/>
-                <w:sz w:val="14"/>
-              </w:rPr>
-              <w:t>No explicit standalone dataset license found in listed evidence sources (checked 2026-09-04).</w:t>
+            <w:r>
+              <w:t>Not explicitly reported in the listed evidence sources (checked 2026-09-04).</w:t>
             </w:r>
           </w:p>
         </w:tc>
@@ -12571,15 +12357,8 @@
             <w:tcW w:type="dxa" w:w="943"/>
           </w:tcPr>
           <w:p>
-            <w:pPr>
-              <w:jc w:val="center"/>
-            </w:pPr>
-            <w:r>
-              <w:rPr>
-                <w:b w:val="0"/>
-                <w:sz w:val="14"/>
-              </w:rPr>
-              <w:t>No explicit statement found in listed evidence sources (checked 2026-09-04).</w:t>
+            <w:r>
+              <w:t>Not explicitly reported in the listed evidence sources (checked 2026-09-04).</w:t>
             </w:r>
           </w:p>
         </w:tc>
@@ -12588,15 +12367,8 @@
             <w:tcW w:type="dxa" w:w="943"/>
           </w:tcPr>
           <w:p>
-            <w:pPr>
-              <w:jc w:val="center"/>
-            </w:pPr>
-            <w:r>
-              <w:rPr>
-                <w:b w:val="0"/>
-                <w:sz w:val="14"/>
-              </w:rPr>
-              <w:t>No explicit statement found in listed evidence sources (checked 2026-09-04).</w:t>
+            <w:r>
+              <w:t>Not explicitly reported in the listed evidence sources (checked 2026-09-04).</w:t>
             </w:r>
           </w:p>
         </w:tc>
@@ -12605,15 +12377,8 @@
             <w:tcW w:type="dxa" w:w="943"/>
           </w:tcPr>
           <w:p>
-            <w:pPr>
-              <w:jc w:val="center"/>
-            </w:pPr>
-            <w:r>
-              <w:rPr>
-                <w:b w:val="0"/>
-                <w:sz w:val="14"/>
-              </w:rPr>
-              <w:t>No explicit dataset-use restriction found in listed evidence sources (checked 2026-09-04).</w:t>
+            <w:r>
+              <w:t>Not explicitly reported in the listed evidence sources (checked 2026-09-04).</w:t>
             </w:r>
           </w:p>
         </w:tc>
@@ -12777,15 +12542,8 @@
             <w:tcW w:type="dxa" w:w="943"/>
           </w:tcPr>
           <w:p>
-            <w:pPr>
-              <w:jc w:val="center"/>
-            </w:pPr>
-            <w:r>
-              <w:rPr>
-                <w:b w:val="0"/>
-                <w:sz w:val="14"/>
-              </w:rPr>
-              <w:t>No explicit statement found in listed evidence sources (checked 2026-09-04).</w:t>
+            <w:r>
+              <w:t>Not explicitly reported in the listed evidence sources (checked 2026-09-04).</w:t>
             </w:r>
           </w:p>
         </w:tc>
@@ -13082,23 +12840,27 @@
         </w:tc>
       </w:tr>
     </w:tbl>
-    <w:p/>
+    <w:p>
+      <w:r>
+        <w:t>注：RSTPReid基于MSMT17构建。其官方仓库的MIT许可证适用于仓库代码，不自动延伸至MSMT17派生图像；表中证据列同时列明底层MSMT17来源和当前证据包中可追溯的入口。使用时应以底层MSMT17协议为准。</w:t>
+      </w:r>
+    </w:p>
     <w:p>
       <w:pPr>
         <w:pStyle w:val="Heading1"/>
       </w:pPr>
       <w:r>
-        <w:t>?? D MP-ReID ??????????????</w:t>
+        <w:t>附录 D MP-ReID 的十二个预定义查询—图库方向</w:t>
       </w:r>
     </w:p>
     <w:p>
       <w:r>
-        <w:t>????????? MP-ReID ????????????????????GR?GI?UR ? UT ???? Ground RGB?Ground Infrared?UAV RGB ? UAV TIR?</w:t>
+        <w:t>表D1将正文表3的三类因素分组展开为十二个具体方向，便于核对正向与反向任务。GR、GI、UR和UT分别表示Ground RGB、Ground Infrared、UAV RGB和UAV TIR。</w:t>
       </w:r>
     </w:p>
     <w:p>
       <w:r>
-        <w:t>? D1 MP-ReID ???????????????</w:t>
+        <w:t>表D1. MP-ReID的十二个预定义查询—图库方向。</w:t>
       </w:r>
     </w:p>
     <w:tbl>
@@ -13121,15 +12883,10 @@
             <w:shd w:fill="D9EAF7"/>
           </w:tcPr>
           <w:p>
-            <w:pPr>
-              <w:jc w:val="center"/>
-            </w:pPr>
-            <w:r>
-              <w:rPr>
-                <w:b/>
-                <w:sz w:val="14"/>
-              </w:rPr>
-              <w:t>表D1. MP-ReID的十二个预定义查询—图库方向。 | 编号</w:t>
+            <w:r>
+              <w:t>表D1. MP-ReID的十二个预定义查询—图库方向。</w:t>
+              <w:br/>
+              <w:t>编号</w:t>
             </w:r>
           </w:p>
         </w:tc>
@@ -14257,17 +14014,17 @@
         <w:pStyle w:val="Heading1"/>
       </w:pPr>
       <w:r>
-        <w:t>?? E ??? ReID ?????</w:t>
+        <w:t>附录 E 结构化 ReID 协议注册表</w:t>
       </w:r>
     </w:p>
     <w:p>
       <w:r>
-        <w:t>??????/?????Query?Gallery???????????????????????????????????????</w:t>
+        <w:t>本附录回答“查询和图库究竟如何构造”。它不替代附录 A 的数据内容登记，也不把多个固定来源对自动合并为一次混合图库评价。</w:t>
       </w:r>
     </w:p>
     <w:p>
       <w:r>
-        <w:t>? E1 ??? ReID ??????</w:t>
+        <w:t>表E1. 结构化 ReID 协议注册表。</w:t>
       </w:r>
     </w:p>
     <w:tbl>

</xml_diff>